<commit_message>
Sync: replace remote with local tree
</commit_message>
<xml_diff>
--- a/backend/data/procurement_process/专机23-17N 惠州至肇庆高速公路白云至三水段项目给排水迁改工程/专机23-17N-蒸汽混凝土砌块/7.供应商资格审核表.docx
+++ b/backend/data/procurement_process/专机23-17N 惠州至肇庆高速公路白云至三水段项目给排水迁改工程/专机23-17N-蒸汽混凝土砌块/7.供应商资格审核表.docx
@@ -281,13 +281,13 @@
               </w:rPr>
               <w:t xml:space="preserve">[  ]专业分包类</w:t>
               <w:br/>
-              <w:t xml:space="preserve"> [  ]劳务分包类</w:t>
+              <w:t xml:space="preserve">[  ]劳务分包类</w:t>
               <w:br/>
-              <w:t xml:space="preserve"> [✓]材料物资类</w:t>
+              <w:t xml:space="preserve">[✓]材料物资类</w:t>
               <w:br/>
-              <w:t xml:space="preserve"> [  ]设备租赁类</w:t>
+              <w:t xml:space="preserve">[  ]设备租赁类</w:t>
               <w:br/>
-              <w:t xml:space="preserve"> [  ]服务类</w:t>
+              <w:t xml:space="preserve">[  ]服务类</w:t>
             </w:r>
           </w:p>
         </w:tc>
@@ -2903,13 +2903,13 @@
               </w:rPr>
               <w:t xml:space="preserve">[  ]专业分包类</w:t>
               <w:br/>
-              <w:t xml:space="preserve"> [  ]劳务分包类</w:t>
+              <w:t xml:space="preserve">[  ]劳务分包类</w:t>
               <w:br/>
-              <w:t xml:space="preserve"> [✓]材料物资类</w:t>
+              <w:t xml:space="preserve">[✓]材料物资类</w:t>
               <w:br/>
-              <w:t xml:space="preserve"> [  ]设备租赁类</w:t>
+              <w:t xml:space="preserve">[  ]设备租赁类</w:t>
               <w:br/>
-              <w:t xml:space="preserve"> [  ]服务类</w:t>
+              <w:t xml:space="preserve">[  ]服务类</w:t>
             </w:r>
           </w:p>
         </w:tc>
@@ -5495,13 +5495,13 @@
               </w:rPr>
               <w:t xml:space="preserve">[  ]专业分包类</w:t>
               <w:br/>
-              <w:t xml:space="preserve"> [  ]劳务分包类</w:t>
+              <w:t xml:space="preserve">[  ]劳务分包类</w:t>
               <w:br/>
-              <w:t xml:space="preserve"> [✓]材料物资类</w:t>
+              <w:t xml:space="preserve">[✓]材料物资类</w:t>
               <w:br/>
-              <w:t xml:space="preserve"> [  ]设备租赁类</w:t>
+              <w:t xml:space="preserve">[  ]设备租赁类</w:t>
               <w:br/>
-              <w:t xml:space="preserve"> [  ]服务类</w:t>
+              <w:t xml:space="preserve">[  ]服务类</w:t>
             </w:r>
           </w:p>
         </w:tc>

</xml_diff>